<commit_message>
Fix chat welcome screen and layout
</commit_message>
<xml_diff>
--- a/MY PROLECT SCREENSHOTS.docx
+++ b/MY PROLECT SCREENSHOTS.docx
@@ -508,6 +508,553 @@
         <w:t xml:space="preserve">        Vector Database</w:t>
       </w:r>
     </w:p>
+    <w:p/>
+    <w:p/>
+    <w:p>
+      <w:r>
+        <w:t>FOOD TABLE IN THE DATABASDE</w:t>
+      </w:r>
+      <w:r>
+        <w:br/>
+      </w:r>
+    </w:p>
+    <w:tbl>
+      <w:tblPr>
+        <w:tblW w:w="0" w:type="auto"/>
+        <w:tblCellSpacing w:w="15" w:type="dxa"/>
+        <w:tblCellMar>
+          <w:top w:w="15" w:type="dxa"/>
+          <w:left w:w="15" w:type="dxa"/>
+          <w:bottom w:w="15" w:type="dxa"/>
+          <w:right w:w="15" w:type="dxa"/>
+        </w:tblCellMar>
+        <w:tblLook w:val="04A0" w:firstRow="1" w:lastRow="0" w:firstColumn="1" w:lastColumn="0" w:noHBand="0" w:noVBand="1"/>
+      </w:tblPr>
+      <w:tblGrid>
+        <w:gridCol w:w="1462"/>
+        <w:gridCol w:w="1526"/>
+        <w:gridCol w:w="2395"/>
+      </w:tblGrid>
+      <w:tr>
+        <w:trPr>
+          <w:tblHeader/>
+          <w:tblCellSpacing w:w="15" w:type="dxa"/>
+        </w:trPr>
+        <w:tc>
+          <w:tcPr>
+            <w:tcW w:w="0" w:type="auto"/>
+            <w:vAlign w:val="center"/>
+            <w:hideMark/>
+          </w:tcPr>
+          <w:p>
+            <w:pPr>
+              <w:rPr>
+                <w:b/>
+                <w:bCs/>
+              </w:rPr>
+            </w:pPr>
+            <w:r>
+              <w:rPr>
+                <w:b/>
+                <w:bCs/>
+              </w:rPr>
+              <w:t>Column</w:t>
+            </w:r>
+          </w:p>
+        </w:tc>
+        <w:tc>
+          <w:tcPr>
+            <w:tcW w:w="0" w:type="auto"/>
+            <w:vAlign w:val="center"/>
+            <w:hideMark/>
+          </w:tcPr>
+          <w:p>
+            <w:pPr>
+              <w:rPr>
+                <w:b/>
+                <w:bCs/>
+              </w:rPr>
+            </w:pPr>
+            <w:r>
+              <w:rPr>
+                <w:b/>
+                <w:bCs/>
+              </w:rPr>
+              <w:t>Type</w:t>
+            </w:r>
+          </w:p>
+        </w:tc>
+        <w:tc>
+          <w:tcPr>
+            <w:tcW w:w="0" w:type="auto"/>
+            <w:vAlign w:val="center"/>
+            <w:hideMark/>
+          </w:tcPr>
+          <w:p>
+            <w:pPr>
+              <w:rPr>
+                <w:b/>
+                <w:bCs/>
+              </w:rPr>
+            </w:pPr>
+            <w:r>
+              <w:rPr>
+                <w:b/>
+                <w:bCs/>
+              </w:rPr>
+              <w:t>Purpose</w:t>
+            </w:r>
+          </w:p>
+        </w:tc>
+      </w:tr>
+      <w:tr>
+        <w:trPr>
+          <w:tblCellSpacing w:w="15" w:type="dxa"/>
+        </w:trPr>
+        <w:tc>
+          <w:tcPr>
+            <w:tcW w:w="0" w:type="auto"/>
+            <w:vAlign w:val="center"/>
+            <w:hideMark/>
+          </w:tcPr>
+          <w:p>
+            <w:r>
+              <w:t>id</w:t>
+            </w:r>
+          </w:p>
+        </w:tc>
+        <w:tc>
+          <w:tcPr>
+            <w:tcW w:w="0" w:type="auto"/>
+            <w:vAlign w:val="center"/>
+            <w:hideMark/>
+          </w:tcPr>
+          <w:p>
+            <w:r>
+              <w:t>INT</w:t>
+            </w:r>
+          </w:p>
+        </w:tc>
+        <w:tc>
+          <w:tcPr>
+            <w:tcW w:w="0" w:type="auto"/>
+            <w:vAlign w:val="center"/>
+            <w:hideMark/>
+          </w:tcPr>
+          <w:p>
+            <w:r>
+              <w:t>Unique ID for each food</w:t>
+            </w:r>
+          </w:p>
+        </w:tc>
+      </w:tr>
+      <w:tr>
+        <w:trPr>
+          <w:tblCellSpacing w:w="15" w:type="dxa"/>
+        </w:trPr>
+        <w:tc>
+          <w:tcPr>
+            <w:tcW w:w="0" w:type="auto"/>
+            <w:vAlign w:val="center"/>
+            <w:hideMark/>
+          </w:tcPr>
+          <w:p>
+            <w:r>
+              <w:t>name</w:t>
+            </w:r>
+          </w:p>
+        </w:tc>
+        <w:tc>
+          <w:tcPr>
+            <w:tcW w:w="0" w:type="auto"/>
+            <w:vAlign w:val="center"/>
+            <w:hideMark/>
+          </w:tcPr>
+          <w:p>
+            <w:proofErr w:type="gramStart"/>
+            <w:r>
+              <w:t>VARCHAR(</w:t>
+            </w:r>
+            <w:proofErr w:type="gramEnd"/>
+            <w:r>
+              <w:t>100)</w:t>
+            </w:r>
+          </w:p>
+        </w:tc>
+        <w:tc>
+          <w:tcPr>
+            <w:tcW w:w="0" w:type="auto"/>
+            <w:vAlign w:val="center"/>
+            <w:hideMark/>
+          </w:tcPr>
+          <w:p>
+            <w:r>
+              <w:t>Food name</w:t>
+            </w:r>
+          </w:p>
+        </w:tc>
+      </w:tr>
+      <w:tr>
+        <w:trPr>
+          <w:tblCellSpacing w:w="15" w:type="dxa"/>
+        </w:trPr>
+        <w:tc>
+          <w:tcPr>
+            <w:tcW w:w="0" w:type="auto"/>
+            <w:vAlign w:val="center"/>
+            <w:hideMark/>
+          </w:tcPr>
+          <w:p>
+            <w:r>
+              <w:t>category</w:t>
+            </w:r>
+          </w:p>
+        </w:tc>
+        <w:tc>
+          <w:tcPr>
+            <w:tcW w:w="0" w:type="auto"/>
+            <w:vAlign w:val="center"/>
+            <w:hideMark/>
+          </w:tcPr>
+          <w:p>
+            <w:proofErr w:type="gramStart"/>
+            <w:r>
+              <w:t>VARCHAR(</w:t>
+            </w:r>
+            <w:proofErr w:type="gramEnd"/>
+            <w:r>
+              <w:t>100)</w:t>
+            </w:r>
+          </w:p>
+        </w:tc>
+        <w:tc>
+          <w:tcPr>
+            <w:tcW w:w="0" w:type="auto"/>
+            <w:vAlign w:val="center"/>
+            <w:hideMark/>
+          </w:tcPr>
+          <w:p>
+            <w:r>
+              <w:t>Food category</w:t>
+            </w:r>
+          </w:p>
+        </w:tc>
+      </w:tr>
+      <w:tr>
+        <w:trPr>
+          <w:tblCellSpacing w:w="15" w:type="dxa"/>
+        </w:trPr>
+        <w:tc>
+          <w:tcPr>
+            <w:tcW w:w="0" w:type="auto"/>
+            <w:vAlign w:val="center"/>
+            <w:hideMark/>
+          </w:tcPr>
+          <w:p>
+            <w:r>
+              <w:t>calories</w:t>
+            </w:r>
+          </w:p>
+        </w:tc>
+        <w:tc>
+          <w:tcPr>
+            <w:tcW w:w="0" w:type="auto"/>
+            <w:vAlign w:val="center"/>
+            <w:hideMark/>
+          </w:tcPr>
+          <w:p>
+            <w:proofErr w:type="gramStart"/>
+            <w:r>
+              <w:t>DECIMAL(</w:t>
+            </w:r>
+            <w:proofErr w:type="gramEnd"/>
+            <w:r>
+              <w:t>10,2)</w:t>
+            </w:r>
+          </w:p>
+        </w:tc>
+        <w:tc>
+          <w:tcPr>
+            <w:tcW w:w="0" w:type="auto"/>
+            <w:vAlign w:val="center"/>
+            <w:hideMark/>
+          </w:tcPr>
+          <w:p>
+            <w:r>
+              <w:t>Calories</w:t>
+            </w:r>
+          </w:p>
+        </w:tc>
+      </w:tr>
+      <w:tr>
+        <w:trPr>
+          <w:tblCellSpacing w:w="15" w:type="dxa"/>
+        </w:trPr>
+        <w:tc>
+          <w:tcPr>
+            <w:tcW w:w="0" w:type="auto"/>
+            <w:vAlign w:val="center"/>
+            <w:hideMark/>
+          </w:tcPr>
+          <w:p>
+            <w:r>
+              <w:t>protein</w:t>
+            </w:r>
+          </w:p>
+        </w:tc>
+        <w:tc>
+          <w:tcPr>
+            <w:tcW w:w="0" w:type="auto"/>
+            <w:vAlign w:val="center"/>
+            <w:hideMark/>
+          </w:tcPr>
+          <w:p>
+            <w:proofErr w:type="gramStart"/>
+            <w:r>
+              <w:t>DECIMAL(</w:t>
+            </w:r>
+            <w:proofErr w:type="gramEnd"/>
+            <w:r>
+              <w:t>10,2)</w:t>
+            </w:r>
+          </w:p>
+        </w:tc>
+        <w:tc>
+          <w:tcPr>
+            <w:tcW w:w="0" w:type="auto"/>
+            <w:vAlign w:val="center"/>
+            <w:hideMark/>
+          </w:tcPr>
+          <w:p>
+            <w:r>
+              <w:t>Protein</w:t>
+            </w:r>
+          </w:p>
+        </w:tc>
+      </w:tr>
+      <w:tr>
+        <w:trPr>
+          <w:tblCellSpacing w:w="15" w:type="dxa"/>
+        </w:trPr>
+        <w:tc>
+          <w:tcPr>
+            <w:tcW w:w="0" w:type="auto"/>
+            <w:vAlign w:val="center"/>
+            <w:hideMark/>
+          </w:tcPr>
+          <w:p>
+            <w:r>
+              <w:t>carbohydrates</w:t>
+            </w:r>
+          </w:p>
+        </w:tc>
+        <w:tc>
+          <w:tcPr>
+            <w:tcW w:w="0" w:type="auto"/>
+            <w:vAlign w:val="center"/>
+            <w:hideMark/>
+          </w:tcPr>
+          <w:p>
+            <w:proofErr w:type="gramStart"/>
+            <w:r>
+              <w:t>DECIMAL(</w:t>
+            </w:r>
+            <w:proofErr w:type="gramEnd"/>
+            <w:r>
+              <w:t>10,2)</w:t>
+            </w:r>
+          </w:p>
+        </w:tc>
+        <w:tc>
+          <w:tcPr>
+            <w:tcW w:w="0" w:type="auto"/>
+            <w:vAlign w:val="center"/>
+            <w:hideMark/>
+          </w:tcPr>
+          <w:p>
+            <w:r>
+              <w:t>Carbohydrates</w:t>
+            </w:r>
+          </w:p>
+        </w:tc>
+      </w:tr>
+      <w:tr>
+        <w:trPr>
+          <w:tblCellSpacing w:w="15" w:type="dxa"/>
+        </w:trPr>
+        <w:tc>
+          <w:tcPr>
+            <w:tcW w:w="0" w:type="auto"/>
+            <w:vAlign w:val="center"/>
+            <w:hideMark/>
+          </w:tcPr>
+          <w:p>
+            <w:r>
+              <w:lastRenderedPageBreak/>
+              <w:t>fat</w:t>
+            </w:r>
+          </w:p>
+        </w:tc>
+        <w:tc>
+          <w:tcPr>
+            <w:tcW w:w="0" w:type="auto"/>
+            <w:vAlign w:val="center"/>
+            <w:hideMark/>
+          </w:tcPr>
+          <w:p>
+            <w:proofErr w:type="gramStart"/>
+            <w:r>
+              <w:t>DECIMAL(</w:t>
+            </w:r>
+            <w:proofErr w:type="gramEnd"/>
+            <w:r>
+              <w:t>10,2)</w:t>
+            </w:r>
+          </w:p>
+        </w:tc>
+        <w:tc>
+          <w:tcPr>
+            <w:tcW w:w="0" w:type="auto"/>
+            <w:vAlign w:val="center"/>
+            <w:hideMark/>
+          </w:tcPr>
+          <w:p>
+            <w:r>
+              <w:t>Fat</w:t>
+            </w:r>
+          </w:p>
+        </w:tc>
+      </w:tr>
+      <w:tr>
+        <w:trPr>
+          <w:tblCellSpacing w:w="15" w:type="dxa"/>
+        </w:trPr>
+        <w:tc>
+          <w:tcPr>
+            <w:tcW w:w="0" w:type="auto"/>
+            <w:vAlign w:val="center"/>
+            <w:hideMark/>
+          </w:tcPr>
+          <w:p>
+            <w:r>
+              <w:t>fibre</w:t>
+            </w:r>
+          </w:p>
+        </w:tc>
+        <w:tc>
+          <w:tcPr>
+            <w:tcW w:w="0" w:type="auto"/>
+            <w:vAlign w:val="center"/>
+            <w:hideMark/>
+          </w:tcPr>
+          <w:p>
+            <w:proofErr w:type="gramStart"/>
+            <w:r>
+              <w:t>DECIMAL(</w:t>
+            </w:r>
+            <w:proofErr w:type="gramEnd"/>
+            <w:r>
+              <w:t>10,2)</w:t>
+            </w:r>
+          </w:p>
+        </w:tc>
+        <w:tc>
+          <w:tcPr>
+            <w:tcW w:w="0" w:type="auto"/>
+            <w:vAlign w:val="center"/>
+            <w:hideMark/>
+          </w:tcPr>
+          <w:p>
+            <w:r>
+              <w:t>Fibre</w:t>
+            </w:r>
+          </w:p>
+        </w:tc>
+      </w:tr>
+      <w:tr>
+        <w:trPr>
+          <w:tblCellSpacing w:w="15" w:type="dxa"/>
+        </w:trPr>
+        <w:tc>
+          <w:tcPr>
+            <w:tcW w:w="0" w:type="auto"/>
+            <w:vAlign w:val="center"/>
+            <w:hideMark/>
+          </w:tcPr>
+          <w:p>
+            <w:r>
+              <w:t>vitamins</w:t>
+            </w:r>
+          </w:p>
+        </w:tc>
+        <w:tc>
+          <w:tcPr>
+            <w:tcW w:w="0" w:type="auto"/>
+            <w:vAlign w:val="center"/>
+            <w:hideMark/>
+          </w:tcPr>
+          <w:p>
+            <w:r>
+              <w:t>TEXT</w:t>
+            </w:r>
+          </w:p>
+        </w:tc>
+        <w:tc>
+          <w:tcPr>
+            <w:tcW w:w="0" w:type="auto"/>
+            <w:vAlign w:val="center"/>
+            <w:hideMark/>
+          </w:tcPr>
+          <w:p>
+            <w:r>
+              <w:t>Vitamin information</w:t>
+            </w:r>
+          </w:p>
+        </w:tc>
+      </w:tr>
+      <w:tr>
+        <w:trPr>
+          <w:tblCellSpacing w:w="15" w:type="dxa"/>
+        </w:trPr>
+        <w:tc>
+          <w:tcPr>
+            <w:tcW w:w="0" w:type="auto"/>
+            <w:vAlign w:val="center"/>
+            <w:hideMark/>
+          </w:tcPr>
+          <w:p>
+            <w:r>
+              <w:t>minerals</w:t>
+            </w:r>
+          </w:p>
+        </w:tc>
+        <w:tc>
+          <w:tcPr>
+            <w:tcW w:w="0" w:type="auto"/>
+            <w:vAlign w:val="center"/>
+            <w:hideMark/>
+          </w:tcPr>
+          <w:p>
+            <w:r>
+              <w:t>TEXT</w:t>
+            </w:r>
+          </w:p>
+        </w:tc>
+        <w:tc>
+          <w:tcPr>
+            <w:tcW w:w="0" w:type="auto"/>
+            <w:vAlign w:val="center"/>
+            <w:hideMark/>
+          </w:tcPr>
+          <w:p>
+            <w:r>
+              <w:t>Mineral information</w:t>
+            </w:r>
+          </w:p>
+        </w:tc>
+      </w:tr>
+    </w:tbl>
+    <w:p/>
     <w:sectPr>
       <w:pgSz w:w="11906" w:h="16838"/>
       <w:pgMar w:top="1440" w:right="1440" w:bottom="1440" w:left="1440" w:header="708" w:footer="708" w:gutter="0"/>
@@ -1121,7 +1668,6 @@
   <w:style w:type="character" w:default="1" w:styleId="DefaultParagraphFont">
     <w:name w:val="Default Paragraph Font"/>
     <w:uiPriority w:val="1"/>
-    <w:semiHidden/>
     <w:unhideWhenUsed/>
   </w:style>
   <w:style w:type="table" w:default="1" w:styleId="TableNormal">

</xml_diff>